<commit_message>
Update paper following reviewer feedback
</commit_message>
<xml_diff>
--- a/Economy_financial/Francesco_Romano_EU_Environmental_Claims_ABM_FINAL.docx
+++ b/Economy_financial/Francesco_Romano_EU_Environmental_Claims_ABM_FINAL.docx
@@ -18,18 +18,24 @@
     </w:p>
     <w:p>
       <w:pPr>
-        <w:pStyle w:val="Normal"/>
+        <w:pStyle w:val="BodyText"/>
         <w:spacing w:before="280" w:after="320"/>
         <w:jc w:val="center"/>
-        <w:rPr/>
-      </w:pPr>
-      <w:r>
         <w:rPr>
           <w:b/>
           <w:color w:val="1C3C64"/>
-          <w:sz w:val="40"/>
-        </w:rPr>
-        <w:t>Preventing Environmental-Claim Misrepresentation in the European Union: An Exploratory Agent-Based Comparison of Stylised Ex-Post Supervision, Voluntary Pre-Screening, and Provenance-Enabled Data Exchange</w:t>
+          <w:sz w:val="38"/>
+          <w:szCs w:val="38"/>
+        </w:rPr>
+      </w:pPr>
+      <w:r>
+        <w:rPr>
+          <w:b/>
+          <w:color w:val="1C3C64"/>
+          <w:sz w:val="38"/>
+          <w:szCs w:val="38"/>
+        </w:rPr>
+        <w:t>Preventing Environmental-Claim Misrepresentation in the European Union: An Exploratory, Partially Agent-Based Comparison of Stylised Ex-Post Supervision, Voluntary Pre-Screening, and Provenance-Enabled Data Exchange</w:t>
       </w:r>
     </w:p>
     <w:p>
@@ -241,7 +247,20 @@
           <w:sz w:val="22"/>
           <w:szCs w:val="22"/>
         </w:rPr>
-        <w:t>Environmental-claim governance is both an information problem and a capacity problem: supervisors observe claims and incomplete evidence rather than firms’ model ground-truth environmental states, while preventive review can delay or suppress defensible communication. This paper develops an exploratory agent-based simulation linking corporate environmental claims to consumers, investors, workforces, a limit-order-book market, and capacity-constrained supervision. It compares a stylised ex-post baseline with two hypothetical add-ons: a voluntary rule-based pre-screening hub and a provenance-enabled environmental-data connector. A 28-parameter Latin-hypercube design evaluates 200 configurations at four horizons, using three paired common-random-number replications per configuration; a post hoc outcome-diverse subset of 12 configurations is re-evaluated with 15 replications. In the archived model outputs, the hub has a positive estimated paired effect on exposure-weighted claim severity in 85.0–90.5% of sampled configurations, while increasing the modelled voluntary-communication gap and public and firm costs. The connector’s severity pattern is mixed at 120 and 365 days and positive in 97.0% and 100.0% of configurations at 1,000 and 2,000 days, while adding cost and conflict workload. These horizon patterns are descriptive and are confounded with reporting cycles, discounting, and the model’s legal calendar. Default rankings reverse across horizons in 80.5% of matched configurations and are sensitive to normative weights. The results are exploratory simulation comparisons, not empirical probabilities, causal estimates, legal conclusions, forecasts, or evidence that any institution would be effective in practice.</w:t>
+        <w:t xml:space="preserve">Environmental-claim governance is both an information problem and a capacity problem: supervisors observe claims and incomplete evidence rather than firms’ model ground-truth environmental states, while preventive review can delay or suppress defensible communication. </w:t>
+      </w:r>
+      <w:r>
+        <w:rPr>
+          <w:sz w:val="22"/>
+        </w:rPr>
+        <w:t>This paper develops an exploratory, partially agent-based simulation linking corporate environmental claims to consumers, investors, workforces, a limit-order-book market, and capacity-constrained supervision. With ten fixed corporate profiles, pre-specified agent classes, and decision rules defined ex ante, it is a transparent comparison of stipulated mechanisms rather than a search for open-ended, unanticipated emergent behaviour.</w:t>
+      </w:r>
+      <w:r>
+        <w:rPr>
+          <w:sz w:val="22"/>
+          <w:szCs w:val="22"/>
+        </w:rPr>
+        <w:t xml:space="preserve"> It compares a stylised ex-post baseline with two hypothetical add-ons: a voluntary rule-based pre-screening hub and a provenance-enabled environmental-data connector. A 28-parameter Latin-hypercube design evaluates 200 configurations at four horizons, using three paired common-random-number replications per configuration; a post hoc outcome-diverse subset of 12 configurations is re-evaluated with 15 replications. In the archived model outputs, the hub has a positive estimated paired effect on exposure-weighted claim severity in 85.0–90.5% of sampled configurations, while increasing the modelled voluntary-communication gap and public and firm costs. The connector’s severity pattern is mixed at 120 and 365 days and positive in 97.0% and 100.0% of configurations at 1,000 and 2,000 days, while adding cost and conflict workload. These horizon patterns are descriptive and are confounded with reporting cycles, discounting, and the model’s legal calendar. Default rankings reverse across horizons in 80.5% of matched configurations and are sensitive to normative weights. The results are exploratory simulation comparisons, not empirical probabilities, causal estimates, legal conclusions, forecasts, or evidence that any institution would be effective in practice.</w:t>
       </w:r>
     </w:p>
     <w:p>
@@ -1889,6 +1908,22 @@
     </w:p>
     <w:p>
       <w:pPr>
+        <w:pStyle w:val="BodyText"/>
+        <w:rPr>
+          <w:sz w:val="22"/>
+          <w:szCs w:val="22"/>
+        </w:rPr>
+      </w:pPr>
+      <w:r>
+        <w:rPr>
+          <w:sz w:val="22"/>
+          <w:szCs w:val="22"/>
+        </w:rPr>
+        <w:t>This is a deliberately partial use of agent-based modelling. The policy campaign contains ten fixed corporate profiles, a small and pre-specified set of agent classes, and decision rules and institutional procedures defined ex ante. Random shocks and interactions generate variation in simulated trajectories, but the model is not designed to produce open-ended adaptation or unforeseen forms of collective behaviour. Accordingly, the analysis is a comparison of stipulated mechanisms: any pattern that emerges is conditional on the specified agents, profiles, rules, and parameter ranges, rather than a discovery claim about unanticipated real-world dynamics.</w:t>
+      </w:r>
+    </w:p>
+    <w:p>
+      <w:pPr>
         <w:pStyle w:val="Normal"/>
         <w:rPr>
           <w:sz w:val="22"/>
@@ -1950,7 +1985,7 @@
     <w:p>
       <w:pPr>
         <w:pStyle w:val="TableNote"/>
-        <w:keepNext/>
+        <w:keepNext w:val="true"/>
         <w:widowControl/>
         <w:rPr/>
       </w:pPr>
@@ -2974,7 +3009,7 @@
     <w:p>
       <w:pPr>
         <w:pStyle w:val="Normal"/>
-        <w:keepNext/>
+        <w:keepNext w:val="true"/>
         <w:spacing w:before="0" w:after="40"/>
         <w:rPr/>
       </w:pPr>
@@ -8682,7 +8717,7 @@
     <w:p>
       <w:pPr>
         <w:pStyle w:val="Caption"/>
-        <w:keepNext/>
+        <w:keepNext w:val="true"/>
         <w:widowControl/>
         <w:jc w:val="center"/>
         <w:rPr/>
@@ -9485,7 +9520,7 @@
     <w:p>
       <w:pPr>
         <w:pStyle w:val="Caption"/>
-        <w:keepNext/>
+        <w:keepNext w:val="true"/>
         <w:widowControl/>
         <w:rPr>
           <w:sz w:val="18"/>
@@ -9503,7 +9538,7 @@
     <w:p>
       <w:pPr>
         <w:pStyle w:val="TableNote"/>
-        <w:keepNext/>
+        <w:keepNext w:val="true"/>
         <w:widowControl/>
         <w:rPr>
           <w:sz w:val="18"/>
@@ -9521,7 +9556,7 @@
     <w:p>
       <w:pPr>
         <w:pStyle w:val="TableNote"/>
-        <w:keepNext/>
+        <w:keepNext w:val="true"/>
         <w:widowControl/>
         <w:rPr>
           <w:sz w:val="18"/>
@@ -9573,6 +9608,7 @@
               <w:pStyle w:val="Normal"/>
               <w:suppressAutoHyphens w:val="true"/>
               <w:spacing w:before="20" w:after="20"/>
+              <w:jc w:val="start"/>
               <w:rPr>
                 <w:rFonts w:eastAsia="ＭＳ 明朝" w:cs=""/>
                 <w:kern w:val="0"/>
@@ -9580,7 +9616,6 @@
                 <w:szCs w:val="16"/>
                 <w:lang w:val="en-US" w:eastAsia="en-US" w:bidi="ar-SA"/>
               </w:rPr>
-              <w:jc w:val="start"/>
             </w:pPr>
             <w:r>
               <w:rPr>
@@ -9608,6 +9643,7 @@
               <w:pStyle w:val="Normal"/>
               <w:suppressAutoHyphens w:val="true"/>
               <w:spacing w:before="20" w:after="20"/>
+              <w:jc w:val="start"/>
               <w:rPr>
                 <w:rFonts w:eastAsia="ＭＳ 明朝" w:cs=""/>
                 <w:kern w:val="0"/>
@@ -9615,7 +9651,6 @@
                 <w:szCs w:val="16"/>
                 <w:lang w:val="en-US" w:eastAsia="en-US" w:bidi="ar-SA"/>
               </w:rPr>
-              <w:jc w:val="start"/>
             </w:pPr>
             <w:r>
               <w:rPr>
@@ -9643,6 +9678,7 @@
               <w:pStyle w:val="Normal"/>
               <w:suppressAutoHyphens w:val="true"/>
               <w:spacing w:before="20" w:after="20"/>
+              <w:jc w:val="start"/>
               <w:rPr>
                 <w:rFonts w:eastAsia="ＭＳ 明朝" w:cs=""/>
                 <w:kern w:val="0"/>
@@ -9650,7 +9686,6 @@
                 <w:szCs w:val="16"/>
                 <w:lang w:val="en-US" w:eastAsia="en-US" w:bidi="ar-SA"/>
               </w:rPr>
-              <w:jc w:val="start"/>
             </w:pPr>
             <w:r>
               <w:rPr>
@@ -9678,6 +9713,7 @@
               <w:pStyle w:val="Normal"/>
               <w:suppressAutoHyphens w:val="true"/>
               <w:spacing w:before="20" w:after="20"/>
+              <w:jc w:val="start"/>
               <w:rPr>
                 <w:rFonts w:eastAsia="ＭＳ 明朝" w:cs=""/>
                 <w:kern w:val="0"/>
@@ -9685,7 +9721,6 @@
                 <w:szCs w:val="16"/>
                 <w:lang w:val="en-US" w:eastAsia="en-US" w:bidi="ar-SA"/>
               </w:rPr>
-              <w:jc w:val="start"/>
             </w:pPr>
             <w:r>
               <w:rPr>
@@ -9717,11 +9752,11 @@
               <w:pStyle w:val="Normal"/>
               <w:suppressAutoHyphens w:val="true"/>
               <w:spacing w:before="20" w:after="20"/>
+              <w:jc w:val="start"/>
               <w:rPr>
                 <w:sz w:val="16"/>
                 <w:szCs w:val="16"/>
               </w:rPr>
-              <w:jc w:val="start"/>
             </w:pPr>
             <w:r>
               <w:rPr>
@@ -9743,6 +9778,7 @@
               <w:pStyle w:val="Normal"/>
               <w:suppressAutoHyphens w:val="true"/>
               <w:spacing w:before="20" w:after="20"/>
+              <w:jc w:val="start"/>
               <w:rPr>
                 <w:rFonts w:eastAsia="ＭＳ 明朝" w:cs=""/>
                 <w:kern w:val="0"/>
@@ -9750,7 +9786,6 @@
                 <w:szCs w:val="16"/>
                 <w:lang w:val="en-US" w:eastAsia="en-US" w:bidi="ar-SA"/>
               </w:rPr>
-              <w:jc w:val="start"/>
             </w:pPr>
             <w:r>
               <w:rPr>
@@ -9775,6 +9810,7 @@
               <w:pStyle w:val="Normal"/>
               <w:suppressAutoHyphens w:val="true"/>
               <w:spacing w:before="20" w:after="20"/>
+              <w:jc w:val="start"/>
               <w:rPr>
                 <w:rFonts w:eastAsia="ＭＳ 明朝" w:cs=""/>
                 <w:kern w:val="0"/>
@@ -9782,7 +9818,6 @@
                 <w:szCs w:val="16"/>
                 <w:lang w:val="en-US" w:eastAsia="en-US" w:bidi="ar-SA"/>
               </w:rPr>
-              <w:jc w:val="start"/>
             </w:pPr>
             <w:r>
               <w:rPr>
@@ -9807,6 +9842,7 @@
               <w:pStyle w:val="Normal"/>
               <w:suppressAutoHyphens w:val="true"/>
               <w:spacing w:before="20" w:after="20"/>
+              <w:jc w:val="start"/>
               <w:rPr>
                 <w:rFonts w:eastAsia="ＭＳ 明朝" w:cs=""/>
                 <w:kern w:val="0"/>
@@ -9814,7 +9850,6 @@
                 <w:szCs w:val="16"/>
                 <w:lang w:val="en-US" w:eastAsia="en-US" w:bidi="ar-SA"/>
               </w:rPr>
-              <w:jc w:val="start"/>
             </w:pPr>
             <w:r>
               <w:rPr>
@@ -9844,6 +9879,7 @@
               <w:pStyle w:val="Normal"/>
               <w:suppressAutoHyphens w:val="true"/>
               <w:spacing w:before="20" w:after="20"/>
+              <w:jc w:val="start"/>
               <w:rPr>
                 <w:rFonts w:eastAsia="ＭＳ 明朝" w:cs=""/>
                 <w:kern w:val="0"/>
@@ -9851,7 +9887,6 @@
                 <w:szCs w:val="16"/>
                 <w:lang w:val="en-US" w:eastAsia="en-US" w:bidi="ar-SA"/>
               </w:rPr>
-              <w:jc w:val="start"/>
             </w:pPr>
             <w:r>
               <w:rPr>
@@ -9876,6 +9911,7 @@
               <w:pStyle w:val="Normal"/>
               <w:suppressAutoHyphens w:val="true"/>
               <w:spacing w:before="20" w:after="20"/>
+              <w:jc w:val="start"/>
               <w:rPr>
                 <w:rFonts w:eastAsia="ＭＳ 明朝" w:cs=""/>
                 <w:kern w:val="0"/>
@@ -9883,7 +9919,6 @@
                 <w:szCs w:val="16"/>
                 <w:lang w:val="en-US" w:eastAsia="en-US" w:bidi="ar-SA"/>
               </w:rPr>
-              <w:jc w:val="start"/>
             </w:pPr>
             <w:r>
               <w:rPr>
@@ -9908,6 +9943,7 @@
               <w:pStyle w:val="Normal"/>
               <w:suppressAutoHyphens w:val="true"/>
               <w:spacing w:before="20" w:after="20"/>
+              <w:jc w:val="start"/>
               <w:rPr>
                 <w:rFonts w:eastAsia="ＭＳ 明朝" w:cs=""/>
                 <w:kern w:val="0"/>
@@ -9915,7 +9951,6 @@
                 <w:szCs w:val="16"/>
                 <w:lang w:val="en-US" w:eastAsia="en-US" w:bidi="ar-SA"/>
               </w:rPr>
-              <w:jc w:val="start"/>
             </w:pPr>
             <w:r>
               <w:rPr>
@@ -9940,6 +9975,7 @@
               <w:pStyle w:val="Normal"/>
               <w:suppressAutoHyphens w:val="true"/>
               <w:spacing w:before="20" w:after="20"/>
+              <w:jc w:val="start"/>
               <w:rPr>
                 <w:rFonts w:eastAsia="ＭＳ 明朝" w:cs=""/>
                 <w:kern w:val="0"/>
@@ -9947,7 +9983,6 @@
                 <w:szCs w:val="16"/>
                 <w:lang w:val="en-US" w:eastAsia="en-US" w:bidi="ar-SA"/>
               </w:rPr>
-              <w:jc w:val="start"/>
             </w:pPr>
             <w:r>
               <w:rPr>
@@ -9977,6 +10012,7 @@
               <w:pStyle w:val="Normal"/>
               <w:suppressAutoHyphens w:val="true"/>
               <w:spacing w:before="20" w:after="20"/>
+              <w:jc w:val="start"/>
               <w:rPr>
                 <w:rFonts w:eastAsia="ＭＳ 明朝" w:cs=""/>
                 <w:kern w:val="0"/>
@@ -9984,7 +10020,6 @@
                 <w:szCs w:val="16"/>
                 <w:lang w:val="en-US" w:eastAsia="en-US" w:bidi="ar-SA"/>
               </w:rPr>
-              <w:jc w:val="start"/>
             </w:pPr>
             <w:r>
               <w:rPr>
@@ -10009,6 +10044,7 @@
               <w:pStyle w:val="Normal"/>
               <w:suppressAutoHyphens w:val="true"/>
               <w:spacing w:before="20" w:after="20"/>
+              <w:jc w:val="start"/>
               <w:rPr>
                 <w:rFonts w:eastAsia="ＭＳ 明朝" w:cs=""/>
                 <w:kern w:val="0"/>
@@ -10016,7 +10052,6 @@
                 <w:szCs w:val="16"/>
                 <w:lang w:val="en-US" w:eastAsia="en-US" w:bidi="ar-SA"/>
               </w:rPr>
-              <w:jc w:val="start"/>
             </w:pPr>
             <w:r>
               <w:rPr>
@@ -10041,6 +10076,7 @@
               <w:pStyle w:val="Normal"/>
               <w:suppressAutoHyphens w:val="true"/>
               <w:spacing w:before="20" w:after="20"/>
+              <w:jc w:val="start"/>
               <w:rPr>
                 <w:rFonts w:eastAsia="ＭＳ 明朝" w:cs=""/>
                 <w:kern w:val="0"/>
@@ -10048,7 +10084,6 @@
                 <w:szCs w:val="16"/>
                 <w:lang w:val="en-US" w:eastAsia="en-US" w:bidi="ar-SA"/>
               </w:rPr>
-              <w:jc w:val="start"/>
             </w:pPr>
             <w:r>
               <w:rPr>
@@ -10073,6 +10108,7 @@
               <w:pStyle w:val="Normal"/>
               <w:suppressAutoHyphens w:val="true"/>
               <w:spacing w:before="20" w:after="20"/>
+              <w:jc w:val="start"/>
               <w:rPr>
                 <w:rFonts w:eastAsia="ＭＳ 明朝" w:cs=""/>
                 <w:kern w:val="0"/>
@@ -10080,7 +10116,6 @@
                 <w:szCs w:val="16"/>
                 <w:lang w:val="en-US" w:eastAsia="en-US" w:bidi="ar-SA"/>
               </w:rPr>
-              <w:jc w:val="start"/>
             </w:pPr>
             <w:r>
               <w:rPr>
@@ -10110,6 +10145,7 @@
               <w:pStyle w:val="Normal"/>
               <w:suppressAutoHyphens w:val="true"/>
               <w:spacing w:before="20" w:after="20"/>
+              <w:jc w:val="start"/>
               <w:rPr>
                 <w:rFonts w:eastAsia="ＭＳ 明朝" w:cs=""/>
                 <w:kern w:val="0"/>
@@ -10117,7 +10153,6 @@
                 <w:szCs w:val="16"/>
                 <w:lang w:val="en-US" w:eastAsia="en-US" w:bidi="ar-SA"/>
               </w:rPr>
-              <w:jc w:val="start"/>
             </w:pPr>
             <w:r>
               <w:rPr>
@@ -10142,6 +10177,7 @@
               <w:pStyle w:val="Normal"/>
               <w:suppressAutoHyphens w:val="true"/>
               <w:spacing w:before="20" w:after="20"/>
+              <w:jc w:val="start"/>
               <w:rPr>
                 <w:rFonts w:eastAsia="ＭＳ 明朝" w:cs=""/>
                 <w:kern w:val="0"/>
@@ -10149,7 +10185,6 @@
                 <w:szCs w:val="16"/>
                 <w:lang w:val="en-US" w:eastAsia="en-US" w:bidi="ar-SA"/>
               </w:rPr>
-              <w:jc w:val="start"/>
             </w:pPr>
             <w:r>
               <w:rPr>
@@ -10174,6 +10209,7 @@
               <w:pStyle w:val="Normal"/>
               <w:suppressAutoHyphens w:val="true"/>
               <w:spacing w:before="20" w:after="20"/>
+              <w:jc w:val="start"/>
               <w:rPr>
                 <w:rFonts w:eastAsia="ＭＳ 明朝" w:cs=""/>
                 <w:kern w:val="0"/>
@@ -10181,7 +10217,6 @@
                 <w:szCs w:val="16"/>
                 <w:lang w:val="en-US" w:eastAsia="en-US" w:bidi="ar-SA"/>
               </w:rPr>
-              <w:jc w:val="start"/>
             </w:pPr>
             <w:r>
               <w:rPr>
@@ -10206,6 +10241,7 @@
               <w:pStyle w:val="Normal"/>
               <w:suppressAutoHyphens w:val="true"/>
               <w:spacing w:before="20" w:after="20"/>
+              <w:jc w:val="start"/>
               <w:rPr>
                 <w:rFonts w:eastAsia="ＭＳ 明朝" w:cs=""/>
                 <w:kern w:val="0"/>
@@ -10213,7 +10249,6 @@
                 <w:szCs w:val="16"/>
                 <w:lang w:val="en-US" w:eastAsia="en-US" w:bidi="ar-SA"/>
               </w:rPr>
-              <w:jc w:val="start"/>
             </w:pPr>
             <w:r>
               <w:rPr>
@@ -10243,6 +10278,7 @@
               <w:pStyle w:val="Normal"/>
               <w:suppressAutoHyphens w:val="true"/>
               <w:spacing w:before="20" w:after="20"/>
+              <w:jc w:val="start"/>
               <w:rPr>
                 <w:rFonts w:eastAsia="ＭＳ 明朝" w:cs=""/>
                 <w:kern w:val="0"/>
@@ -10250,7 +10286,6 @@
                 <w:szCs w:val="16"/>
                 <w:lang w:val="en-US" w:eastAsia="en-US" w:bidi="ar-SA"/>
               </w:rPr>
-              <w:jc w:val="start"/>
             </w:pPr>
             <w:r>
               <w:rPr>
@@ -10275,6 +10310,7 @@
               <w:pStyle w:val="Normal"/>
               <w:suppressAutoHyphens w:val="true"/>
               <w:spacing w:before="20" w:after="20"/>
+              <w:jc w:val="start"/>
               <w:rPr>
                 <w:rFonts w:eastAsia="ＭＳ 明朝" w:cs=""/>
                 <w:kern w:val="0"/>
@@ -10282,7 +10318,6 @@
                 <w:szCs w:val="16"/>
                 <w:lang w:val="en-US" w:eastAsia="en-US" w:bidi="ar-SA"/>
               </w:rPr>
-              <w:jc w:val="start"/>
             </w:pPr>
             <w:r>
               <w:rPr>
@@ -10307,6 +10342,7 @@
               <w:pStyle w:val="Normal"/>
               <w:suppressAutoHyphens w:val="true"/>
               <w:spacing w:before="20" w:after="20"/>
+              <w:jc w:val="start"/>
               <w:rPr>
                 <w:rFonts w:eastAsia="ＭＳ 明朝" w:cs=""/>
                 <w:kern w:val="0"/>
@@ -10314,7 +10350,6 @@
                 <w:szCs w:val="16"/>
                 <w:lang w:val="en-US" w:eastAsia="en-US" w:bidi="ar-SA"/>
               </w:rPr>
-              <w:jc w:val="start"/>
             </w:pPr>
             <w:r>
               <w:rPr>
@@ -10339,6 +10374,7 @@
               <w:pStyle w:val="Normal"/>
               <w:suppressAutoHyphens w:val="true"/>
               <w:spacing w:before="20" w:after="20"/>
+              <w:jc w:val="start"/>
               <w:rPr>
                 <w:rFonts w:eastAsia="ＭＳ 明朝" w:cs=""/>
                 <w:kern w:val="0"/>
@@ -10346,7 +10382,6 @@
                 <w:szCs w:val="16"/>
                 <w:lang w:val="en-US" w:eastAsia="en-US" w:bidi="ar-SA"/>
               </w:rPr>
-              <w:jc w:val="start"/>
             </w:pPr>
             <w:r>
               <w:rPr>
@@ -10376,6 +10411,7 @@
               <w:pStyle w:val="Normal"/>
               <w:suppressAutoHyphens w:val="true"/>
               <w:spacing w:before="20" w:after="20"/>
+              <w:jc w:val="start"/>
               <w:rPr>
                 <w:rFonts w:eastAsia="ＭＳ 明朝" w:cs=""/>
                 <w:kern w:val="0"/>
@@ -10383,7 +10419,6 @@
                 <w:szCs w:val="16"/>
                 <w:lang w:val="en-US" w:eastAsia="en-US" w:bidi="ar-SA"/>
               </w:rPr>
-              <w:jc w:val="start"/>
             </w:pPr>
             <w:r>
               <w:rPr>
@@ -10408,6 +10443,7 @@
               <w:pStyle w:val="Normal"/>
               <w:suppressAutoHyphens w:val="true"/>
               <w:spacing w:before="20" w:after="20"/>
+              <w:jc w:val="start"/>
               <w:rPr>
                 <w:rFonts w:eastAsia="ＭＳ 明朝" w:cs=""/>
                 <w:kern w:val="0"/>
@@ -10415,7 +10451,6 @@
                 <w:szCs w:val="16"/>
                 <w:lang w:val="en-US" w:eastAsia="en-US" w:bidi="ar-SA"/>
               </w:rPr>
-              <w:jc w:val="start"/>
             </w:pPr>
             <w:r>
               <w:rPr>
@@ -10440,6 +10475,7 @@
               <w:pStyle w:val="Normal"/>
               <w:suppressAutoHyphens w:val="true"/>
               <w:spacing w:before="20" w:after="20"/>
+              <w:jc w:val="start"/>
               <w:rPr>
                 <w:rFonts w:eastAsia="ＭＳ 明朝" w:cs=""/>
                 <w:kern w:val="0"/>
@@ -10447,7 +10483,6 @@
                 <w:szCs w:val="16"/>
                 <w:lang w:val="en-US" w:eastAsia="en-US" w:bidi="ar-SA"/>
               </w:rPr>
-              <w:jc w:val="start"/>
             </w:pPr>
             <w:r>
               <w:rPr>
@@ -10472,6 +10507,7 @@
               <w:pStyle w:val="Normal"/>
               <w:suppressAutoHyphens w:val="true"/>
               <w:spacing w:before="20" w:after="20"/>
+              <w:jc w:val="start"/>
               <w:rPr>
                 <w:rFonts w:eastAsia="ＭＳ 明朝" w:cs=""/>
                 <w:kern w:val="0"/>
@@ -10479,7 +10515,6 @@
                 <w:szCs w:val="16"/>
                 <w:lang w:val="en-US" w:eastAsia="en-US" w:bidi="ar-SA"/>
               </w:rPr>
-              <w:jc w:val="start"/>
             </w:pPr>
             <w:r>
               <w:rPr>
@@ -10509,6 +10544,7 @@
               <w:pStyle w:val="Normal"/>
               <w:suppressAutoHyphens w:val="true"/>
               <w:spacing w:before="20" w:after="20"/>
+              <w:jc w:val="start"/>
               <w:rPr>
                 <w:rFonts w:eastAsia="ＭＳ 明朝" w:cs=""/>
                 <w:kern w:val="0"/>
@@ -10516,7 +10552,6 @@
                 <w:szCs w:val="16"/>
                 <w:lang w:val="en-US" w:eastAsia="en-US" w:bidi="ar-SA"/>
               </w:rPr>
-              <w:jc w:val="start"/>
             </w:pPr>
             <w:r>
               <w:rPr>
@@ -10541,6 +10576,7 @@
               <w:pStyle w:val="Normal"/>
               <w:suppressAutoHyphens w:val="true"/>
               <w:spacing w:before="20" w:after="20"/>
+              <w:jc w:val="start"/>
               <w:rPr>
                 <w:rFonts w:eastAsia="ＭＳ 明朝" w:cs=""/>
                 <w:kern w:val="0"/>
@@ -10548,7 +10584,6 @@
                 <w:szCs w:val="16"/>
                 <w:lang w:val="en-US" w:eastAsia="en-US" w:bidi="ar-SA"/>
               </w:rPr>
-              <w:jc w:val="start"/>
             </w:pPr>
             <w:r>
               <w:rPr>
@@ -10573,6 +10608,7 @@
               <w:pStyle w:val="Normal"/>
               <w:suppressAutoHyphens w:val="true"/>
               <w:spacing w:before="20" w:after="20"/>
+              <w:jc w:val="start"/>
               <w:rPr>
                 <w:rFonts w:eastAsia="ＭＳ 明朝" w:cs=""/>
                 <w:kern w:val="0"/>
@@ -10580,7 +10616,6 @@
                 <w:szCs w:val="16"/>
                 <w:lang w:val="en-US" w:eastAsia="en-US" w:bidi="ar-SA"/>
               </w:rPr>
-              <w:jc w:val="start"/>
             </w:pPr>
             <w:r>
               <w:rPr>
@@ -10605,6 +10640,7 @@
               <w:pStyle w:val="Normal"/>
               <w:suppressAutoHyphens w:val="true"/>
               <w:spacing w:before="20" w:after="20"/>
+              <w:jc w:val="start"/>
               <w:rPr>
                 <w:rFonts w:eastAsia="ＭＳ 明朝" w:cs=""/>
                 <w:kern w:val="0"/>
@@ -10612,7 +10648,6 @@
                 <w:szCs w:val="16"/>
                 <w:lang w:val="en-US" w:eastAsia="en-US" w:bidi="ar-SA"/>
               </w:rPr>
-              <w:jc w:val="start"/>
             </w:pPr>
             <w:r>
               <w:rPr>
@@ -10643,6 +10678,7 @@
               <w:pStyle w:val="Normal"/>
               <w:suppressAutoHyphens w:val="true"/>
               <w:spacing w:before="20" w:after="20"/>
+              <w:jc w:val="start"/>
               <w:rPr>
                 <w:rFonts w:eastAsia="ＭＳ 明朝" w:cs=""/>
                 <w:kern w:val="0"/>
@@ -10650,7 +10686,6 @@
                 <w:szCs w:val="16"/>
                 <w:lang w:val="en-US" w:eastAsia="en-US" w:bidi="ar-SA"/>
               </w:rPr>
-              <w:jc w:val="start"/>
             </w:pPr>
             <w:r>
               <w:rPr>
@@ -10675,6 +10710,7 @@
               <w:pStyle w:val="Normal"/>
               <w:suppressAutoHyphens w:val="true"/>
               <w:spacing w:before="20" w:after="20"/>
+              <w:jc w:val="start"/>
               <w:rPr>
                 <w:rFonts w:eastAsia="ＭＳ 明朝" w:cs=""/>
                 <w:kern w:val="0"/>
@@ -10682,7 +10718,6 @@
                 <w:szCs w:val="16"/>
                 <w:lang w:val="en-US" w:eastAsia="en-US" w:bidi="ar-SA"/>
               </w:rPr>
-              <w:jc w:val="start"/>
             </w:pPr>
             <w:r>
               <w:rPr>
@@ -10707,6 +10742,7 @@
               <w:pStyle w:val="Normal"/>
               <w:suppressAutoHyphens w:val="true"/>
               <w:spacing w:before="20" w:after="20"/>
+              <w:jc w:val="start"/>
               <w:rPr>
                 <w:rFonts w:eastAsia="ＭＳ 明朝" w:cs=""/>
                 <w:kern w:val="0"/>
@@ -10714,7 +10750,6 @@
                 <w:szCs w:val="16"/>
                 <w:lang w:val="en-US" w:eastAsia="en-US" w:bidi="ar-SA"/>
               </w:rPr>
-              <w:jc w:val="start"/>
             </w:pPr>
             <w:r>
               <w:rPr>
@@ -10739,6 +10774,7 @@
               <w:pStyle w:val="Normal"/>
               <w:suppressAutoHyphens w:val="true"/>
               <w:spacing w:before="20" w:after="20"/>
+              <w:jc w:val="start"/>
               <w:rPr>
                 <w:rFonts w:eastAsia="ＭＳ 明朝" w:cs=""/>
                 <w:kern w:val="0"/>
@@ -10746,7 +10782,6 @@
                 <w:szCs w:val="16"/>
                 <w:lang w:val="en-US" w:eastAsia="en-US" w:bidi="ar-SA"/>
               </w:rPr>
-              <w:jc w:val="start"/>
             </w:pPr>
             <w:r>
               <w:rPr>
@@ -11092,7 +11127,7 @@
     </w:p>
     <w:p>
       <w:pPr>
-        <w:pStyle w:val="Normal"/>
+        <w:pStyle w:val="BodyText"/>
         <w:rPr>
           <w:sz w:val="22"/>
           <w:szCs w:val="22"/>
@@ -11103,7 +11138,7 @@
           <w:sz w:val="22"/>
           <w:szCs w:val="22"/>
         </w:rPr>
-        <w:t>The model is an exploratory computational laboratory, not a policy recommendation engine, empirical forecast, legal evaluation, or causal study. Future work should calibrate behavioural, enforcement, measurement, and cost channels; extend facility/value-chain representation; increase replication; test business-day and reporting-cadence conventions; isolate legal-calendar and accumulation mechanisms; and develop jurisdiction-specific legal modules. Financial work should repair the price-impact diagnostic and dynamically ablate the existing treasury-price-to-balance pathway before any market-discipline claim.</w:t>
+        <w:t>The model should be read as version zero of a broader research programme, not as a policy recommendation engine, empirical forecast, legal evaluation, or causal study. Future versions should replace the current ten fixed corporate profiles with a larger, heterogeneous population of firm agents whose communication, investment, and compliance choices can evolve through opportunism, adherence to rules, conviction, learning, and interaction with stakeholders. Alongside this extension, future research should calibrate behavioural, enforcement, measurement, and cost channels; extend facility and value-chain representation; increase replication; test business-day and reporting-cadence conventions; isolate legal-calendar and accumulation mechanisms; and develop jurisdiction-specific legal modules. Financial work should repair the price-impact diagnostic and dynamically ablate the existing treasury-price-to-balance pathway before any market-discipline claim.</w:t>
       </w:r>
     </w:p>
     <w:p>
@@ -11119,53 +11154,141 @@
     </w:p>
     <w:p>
       <w:pPr>
-        <w:pStyle w:val="Normal"/>
-        <w:rPr>
-          <w:sz w:val="22"/>
-          <w:szCs w:val="22"/>
-        </w:rPr>
-      </w:pPr>
-      <w:r>
-        <w:rPr>
-          <w:sz w:val="22"/>
-          <w:szCs w:val="22"/>
-        </w:rPr>
-        <w:t>The supplied project contains the model, parameter documentation, tests, archived run-level outputs, manifests, figures, and reproducibility notes. It does not preserve the exact dirty source tree used for the principal campaign and therefore is not described as a complete executable replication archive. The archival provenance package in provenance/global_lhs_2026-07-15/ documents the global LHS campaign's recorded code version, 1645f3589408503894c7e8f44a92ffe382a9a5b4+dirty, together with the documented base commit, a partially reconstructed candidate source snapshot, execution configuration, recoverable environment information, limitations, and SHA-256 checksums. It preserves the original outputs unchanged but does not claim recovery of the original dirty worktree or bitwise reproducibility.</w:t>
-      </w:r>
-    </w:p>
-    <w:p>
-      <w:pPr>
-        <w:pStyle w:val="Normal"/>
-        <w:rPr>
-          <w:sz w:val="22"/>
-          <w:szCs w:val="22"/>
-        </w:rPr>
-      </w:pPr>
-      <w:r>
+        <w:pStyle w:val="BodyText"/>
+        <w:spacing w:before="0" w:after="80"/>
         <w:rPr>
           <w:color w:val="000000"/>
           <w:sz w:val="22"/>
-          <w:szCs w:val="22"/>
-        </w:rPr>
-        <w:t>The code and replication materials are available through the GitHub repository already cited in the manuscript.</w:t>
-      </w:r>
-    </w:p>
-    <w:p>
-      <w:pPr>
-        <w:pStyle w:val="Normal"/>
-        <w:rPr>
-          <w:sz w:val="22"/>
-          <w:szCs w:val="22"/>
         </w:rPr>
       </w:pPr>
       <w:r>
         <w:rPr>
           <w:color w:val="000000"/>
           <w:sz w:val="22"/>
-          <w:szCs w:val="22"/>
-        </w:rPr>
-        <w:t>https://github.com/francescoromano1407-stack/Financial-market-simulation</w:t>
-      </w:r>
+        </w:rPr>
+        <w:t>The authoritative publication results are preserved in the project archive as machine-readable configuration files, manifests, run-level outputs, summaries, figures, and logs. The 846 files constituting the archived global-LHS campaign have been verified against their recorded SHA-256 checksums; the archived results therefore permit exact inspection and re-aggregation of the results reported in this paper.</w:t>
+      </w:r>
+    </w:p>
+    <w:p>
+      <w:pPr>
+        <w:pStyle w:val="BodyText"/>
+        <w:spacing w:before="0" w:after="80"/>
+        <w:rPr>
+          <w:color w:val="000000"/>
+          <w:sz w:val="22"/>
+        </w:rPr>
+      </w:pPr>
+      <w:r>
+        <w:rPr>
+          <w:color w:val="000000"/>
+          <w:sz w:val="22"/>
+        </w:rPr>
+        <w:t xml:space="preserve">The campaign was executed from source identified in its manifests as </w:t>
+      </w:r>
+      <w:r>
+        <w:rPr>
+          <w:rStyle w:val="Testosorgente"/>
+          <w:color w:val="000000"/>
+          <w:sz w:val="22"/>
+        </w:rPr>
+        <w:t>1645f3589408503894c7e8f44a92ffe382a9a5b4+dirty</w:t>
+      </w:r>
+      <w:r>
+        <w:rPr>
+          <w:color w:val="000000"/>
+          <w:sz w:val="22"/>
+        </w:rPr>
+        <w:t xml:space="preserve">. The original dirty working tree was not retained and cannot be recovered as an authenticated source snapshot. The best available reconstruction is commit </w:t>
+      </w:r>
+      <w:r>
+        <w:rPr>
+          <w:rStyle w:val="Testosorgente"/>
+          <w:color w:val="000000"/>
+          <w:sz w:val="22"/>
+        </w:rPr>
+        <w:t>00134a694e653fc2ce74b62eab1e8c6e9d0f67f7</w:t>
+      </w:r>
+      <w:r>
+        <w:rPr>
+          <w:color w:val="000000"/>
+          <w:sz w:val="22"/>
+        </w:rPr>
+        <w:t>, a direct child of the recorded base commit, created shortly after completion of the campaign and containing the relevant source files and archived outputs. It is provided as a frozen candidate source snapshot, not as a verified copy of the original dirty worktree.</w:t>
+      </w:r>
+    </w:p>
+    <w:p>
+      <w:pPr>
+        <w:pStyle w:val="BodyText"/>
+        <w:spacing w:before="0" w:after="80"/>
+        <w:rPr>
+          <w:color w:val="000000"/>
+          <w:sz w:val="22"/>
+        </w:rPr>
+      </w:pPr>
+      <w:r>
+        <w:rPr>
+          <w:color w:val="000000"/>
+          <w:sz w:val="22"/>
+        </w:rPr>
+        <w:t>The archive therefore supports exact verification of the published outputs and a partially reconstructed source provenance, but it does not claim bitwise executable replication of the historical campaign. A complete executable replication release would require a clean tagged source tree, a locked execution environment, and a fresh run validated against the archived output checksums.</w:t>
+      </w:r>
+    </w:p>
+    <w:p>
+      <w:pPr>
+        <w:pStyle w:val="BodyText"/>
+        <w:spacing w:before="0" w:after="80"/>
+        <w:rPr>
+          <w:color w:val="000000"/>
+          <w:sz w:val="22"/>
+        </w:rPr>
+      </w:pPr>
+      <w:r>
+        <w:rPr>
+          <w:color w:val="000000"/>
+          <w:sz w:val="22"/>
+        </w:rPr>
+        <w:t>The code, archived outputs, provenance materials, and candidate source snapshot are available at:</w:t>
+      </w:r>
+    </w:p>
+    <w:p>
+      <w:pPr>
+        <w:pStyle w:val="BodyText"/>
+        <w:spacing w:before="0" w:after="80"/>
+        <w:rPr>
+          <w:color w:val="000000"/>
+          <w:sz w:val="22"/>
+        </w:rPr>
+      </w:pPr>
+      <w:hyperlink r:id="rId6">
+        <w:r>
+          <w:rPr>
+            <w:rStyle w:val="Hyperlink"/>
+            <w:color w:val="000000"/>
+            <w:sz w:val="22"/>
+          </w:rPr>
+          <w:t>https://github.com/francescoromano1407-stack/Financial-market-simulation</w:t>
+        </w:r>
+      </w:hyperlink>
+    </w:p>
+    <w:p>
+      <w:pPr>
+        <w:pStyle w:val="BodyText"/>
+        <w:spacing w:before="0" w:after="80"/>
+        <w:rPr>
+          <w:color w:val="000000"/>
+          <w:sz w:val="22"/>
+        </w:rPr>
+      </w:pPr>
+      <w:hyperlink r:id="rId7">
+        <w:r>
+          <w:rPr>
+            <w:rStyle w:val="Hyperlink"/>
+            <w:color w:val="000000"/>
+            <w:sz w:val="22"/>
+          </w:rPr>
+          <w:t>https://github.com/francescoromano1407-stack/Financial-market-simulation/commit/00134a694e653fc2ce74b62eab1e8c6e9d0f67f7</w:t>
+        </w:r>
+      </w:hyperlink>
     </w:p>
     <w:p>
       <w:pPr>
@@ -11855,7 +11978,7 @@
         </w:rPr>
         <w:t xml:space="preserve">Parguel, B., Benoit-Moreau, F., and Larceneux, F. (2011). How sustainability ratings might deter greenwashing: A closer look at ethical corporate communication. Journal of Business Ethics, 102(1), 15-28. </w:t>
       </w:r>
-      <w:hyperlink r:id="rId6">
+      <w:hyperlink r:id="rId8">
         <w:r>
           <w:rPr>
             <w:rStyle w:val="Hyperlink"/>
@@ -13413,6 +13536,7 @@
     <w:p>
       <w:pPr>
         <w:pStyle w:val="Normal"/>
+        <w:spacing w:before="0" w:after="80"/>
         <w:rPr>
           <w:sz w:val="22"/>
           <w:szCs w:val="22"/>
@@ -13427,12 +13551,12 @@
       </w:r>
     </w:p>
     <w:sectPr>
-      <w:headerReference w:type="even" r:id="rId7"/>
-      <w:headerReference w:type="default" r:id="rId8"/>
-      <w:headerReference w:type="first" r:id="rId9"/>
-      <w:footerReference w:type="even" r:id="rId10"/>
-      <w:footerReference w:type="default" r:id="rId11"/>
-      <w:footerReference w:type="first" r:id="rId12"/>
+      <w:headerReference w:type="even" r:id="rId9"/>
+      <w:headerReference w:type="default" r:id="rId10"/>
+      <w:headerReference w:type="first" r:id="rId11"/>
+      <w:footerReference w:type="even" r:id="rId12"/>
+      <w:footerReference w:type="default" r:id="rId13"/>
+      <w:footerReference w:type="first" r:id="rId14"/>
       <w:type w:val="nextPage"/>
       <w:pgSz w:w="12240" w:h="15840"/>
       <w:pgMar w:left="1440" w:right="1440" w:gutter="0" w:header="432" w:top="1325" w:footer="432" w:bottom="1267"/>
@@ -13512,7 +13636,7 @@
     </w:r>
     <w:r>
       <w:rPr/>
-      <w:t>27</w:t>
+      <w:t>28</w:t>
     </w:r>
     <w:r>
       <w:rPr/>
@@ -15192,6 +15316,13 @@
       <w:u w:val="single"/>
     </w:rPr>
   </w:style>
+  <w:style w:type="character" w:styleId="Testosorgente">
+    <w:name w:val="Testo sorgente"/>
+    <w:qFormat/>
+    <w:rPr>
+      <w:rFonts w:ascii="Liberation Mono" w:hAnsi="Liberation Mono" w:eastAsia="Liberation Mono" w:cs="Liberation Mono"/>
+    </w:rPr>
+  </w:style>
   <w:style w:type="paragraph" w:styleId="Titolo">
     <w:name w:val="Titolo"/>
     <w:basedOn w:val="Normal"/>
@@ -15290,15 +15421,15 @@
       <w:rFonts w:cs="Arial"/>
     </w:rPr>
   </w:style>
-  <w:style w:type="paragraph" w:styleId="Intestazioneepidipagina">
-    <w:name w:val="Intestazione e piè di pagina"/>
+  <w:style w:type="paragraph" w:styleId="Intestazioneepidipaginauser">
+    <w:name w:val="Intestazione e piè di pagina (user)"/>
     <w:basedOn w:val="Normal"/>
     <w:qFormat/>
     <w:pPr/>
     <w:rPr/>
   </w:style>
-  <w:style w:type="paragraph" w:styleId="Intestazioneepidipaginauser">
-    <w:name w:val="Intestazione e piè di pagina (user)"/>
+  <w:style w:type="paragraph" w:styleId="Intestazioneepidipagina">
+    <w:name w:val="Intestazione e piè di pagina"/>
     <w:basedOn w:val="Normal"/>
     <w:qFormat/>
     <w:pPr/>
@@ -15680,7 +15811,7 @@
   </w:style>
   <w:style w:type="paragraph" w:styleId="IndexHeading">
     <w:name w:val="index heading"/>
-    <w:basedOn w:val="Titolo"/>
+    <w:basedOn w:val="Titolouser"/>
     <w:pPr/>
     <w:rPr/>
   </w:style>
@@ -15757,8 +15888,8 @@
       <w:lang w:val="en-US" w:eastAsia="en-US" w:bidi="ar-SA"/>
     </w:rPr>
   </w:style>
-  <w:style w:type="paragraph" w:styleId="Contenutotabella">
-    <w:name w:val="Contenuto tabella"/>
+  <w:style w:type="paragraph" w:styleId="Contenutotabellauser">
+    <w:name w:val="Contenuto tabella (user)"/>
     <w:basedOn w:val="Normal"/>
     <w:qFormat/>
     <w:pPr>
@@ -15767,9 +15898,9 @@
     </w:pPr>
     <w:rPr/>
   </w:style>
-  <w:style w:type="paragraph" w:styleId="Titolotabella">
-    <w:name w:val="Titolo tabella"/>
-    <w:basedOn w:val="Contenutotabella"/>
+  <w:style w:type="paragraph" w:styleId="Titolotabellauser">
+    <w:name w:val="Titolo tabella (user)"/>
+    <w:basedOn w:val="Contenutotabellauser"/>
     <w:qFormat/>
     <w:pPr>
       <w:suppressLineNumbers/>
@@ -15780,8 +15911,8 @@
       <w:bCs/>
     </w:rPr>
   </w:style>
-  <w:style w:type="numbering" w:styleId="Nessunelenco" w:default="1">
-    <w:name w:val="Nessun elenco"/>
+  <w:style w:type="numbering" w:styleId="Nessunelencouser" w:default="1">
+    <w:name w:val="Nessun elenco (user)"/>
     <w:uiPriority w:val="99"/>
     <w:semiHidden/>
     <w:unhideWhenUsed/>

</xml_diff>

<commit_message>
Correct repository links in paper
</commit_message>
<xml_diff>
--- a/Economy_financial/Francesco_Romano_EU_Environmental_Claims_ABM_FINAL.docx
+++ b/Economy_financial/Francesco_Romano_EU_Environmental_Claims_ABM_FINAL.docx
@@ -11262,11 +11262,10 @@
       <w:hyperlink r:id="rId6">
         <w:r>
           <w:rPr>
-            <w:rStyle w:val="Hyperlink"/>
             <w:color w:val="000000"/>
             <w:sz w:val="22"/>
           </w:rPr>
-          <w:t>https://github.com/francescoromano1407-stack/Financial-market-simulation</w:t>
+          <w:t>https://github.com/francescoromano1407-stack/eu-environmental-claims-abm</w:t>
         </w:r>
       </w:hyperlink>
     </w:p>
@@ -11279,16 +11278,13 @@
           <w:sz w:val="22"/>
         </w:rPr>
       </w:pPr>
-      <w:hyperlink r:id="rId7">
-        <w:r>
-          <w:rPr>
-            <w:rStyle w:val="Hyperlink"/>
-            <w:color w:val="000000"/>
-            <w:sz w:val="22"/>
-          </w:rPr>
-          <w:t>https://github.com/francescoromano1407-stack/Financial-market-simulation/commit/00134a694e653fc2ce74b62eab1e8c6e9d0f67f7</w:t>
-        </w:r>
-      </w:hyperlink>
+      <w:r>
+        <w:rPr>
+          <w:color w:val="000000"/>
+          <w:sz w:val="22"/>
+        </w:rPr>
+        <w:t>https://github.com/francescoromano1407-stack/eu-environmental-claims-abm/commit/00134a694e653fc2ce74b62eab1e8c6e9d0f67f7</w:t>
+      </w:r>
     </w:p>
     <w:p>
       <w:pPr>
@@ -11978,7 +11974,7 @@
         </w:rPr>
         <w:t xml:space="preserve">Parguel, B., Benoit-Moreau, F., and Larceneux, F. (2011). How sustainability ratings might deter greenwashing: A closer look at ethical corporate communication. Journal of Business Ethics, 102(1), 15-28. </w:t>
       </w:r>
-      <w:hyperlink r:id="rId8">
+      <w:hyperlink r:id="rId7">
         <w:r>
           <w:rPr>
             <w:rStyle w:val="Hyperlink"/>
@@ -13551,12 +13547,12 @@
       </w:r>
     </w:p>
     <w:sectPr>
-      <w:headerReference w:type="even" r:id="rId9"/>
-      <w:headerReference w:type="default" r:id="rId10"/>
-      <w:headerReference w:type="first" r:id="rId11"/>
-      <w:footerReference w:type="even" r:id="rId12"/>
-      <w:footerReference w:type="default" r:id="rId13"/>
-      <w:footerReference w:type="first" r:id="rId14"/>
+      <w:headerReference w:type="even" r:id="rId8"/>
+      <w:headerReference w:type="default" r:id="rId9"/>
+      <w:headerReference w:type="first" r:id="rId10"/>
+      <w:footerReference w:type="even" r:id="rId11"/>
+      <w:footerReference w:type="default" r:id="rId12"/>
+      <w:footerReference w:type="first" r:id="rId13"/>
       <w:type w:val="nextPage"/>
       <w:pgSz w:w="12240" w:h="15840"/>
       <w:pgMar w:left="1440" w:right="1440" w:gutter="0" w:header="432" w:top="1325" w:footer="432" w:bottom="1267"/>

</xml_diff>